<commit_message>
Review guide: distinguish the demo app URL from the public website
Co-Authored-By: Claude Opus 5 <noreply@anthropic.com>
</commit_message>
<xml_diff>
--- a/docs/NestWell-Prototype-Review-Guide.docx
+++ b/docs/NestWell-Prototype-Review-Guide.docx
@@ -450,7 +450,7 @@
                 <w:i/>
                 <w:iCs/>
               </w:rPr>
-              <w:t xml:space="preserve">The address will move to hellonestwell.com once the domain is connected; the old address will keep working.</w:t>
+              <w:t xml:space="preserve">This is the demo app. The public NestWell website is separate, at hellonestwell.com.</w:t>
             </w:r>
           </w:p>
         </w:tc>
@@ -5560,7 +5560,7 @@
                 <w:sz w:val="20"/>
                 <w:szCs w:val="20"/>
               </w:rPr>
-              <w:t xml:space="preserve">The app (install from a phone)</w:t>
+              <w:t xml:space="preserve">The demo app (install from a phone)</w:t>
             </w:r>
           </w:p>
         </w:tc>
@@ -5585,7 +5585,7 @@
                 <w:sz w:val="20"/>
                 <w:szCs w:val="20"/>
               </w:rPr>
-              <w:t xml:space="preserve">https://shahablo.github.io/NestWell/  — moving to hellonestwell.com</w:t>
+              <w:t xml:space="preserve">https://shahablo.github.io/NestWell/</w:t>
             </w:r>
           </w:p>
         </w:tc>
@@ -5976,7 +5976,7 @@
                 <w:sz w:val="20"/>
                 <w:szCs w:val="20"/>
               </w:rPr>
-              <w:t xml:space="preserve">The marketing website (in progress)</w:t>
+              <w:t xml:space="preserve">The public website</w:t>
             </w:r>
           </w:p>
         </w:tc>
@@ -6001,7 +6001,7 @@
                 <w:sz w:val="20"/>
                 <w:szCs w:val="20"/>
               </w:rPr>
-              <w:t xml:space="preserve">https://github.com/Shahablo/nestwell_website → hellonestwell.com</w:t>
+              <w:t xml:space="preserve">https://hellonestwell.com (source: github.com/Shahablo/nestwell_website)</w:t>
             </w:r>
           </w:p>
         </w:tc>

</xml_diff>